<commit_message>
Add report organization section to final capstone document
Add new subsection §1.7 Report Organization to Chapter 1 of the document.

Replit-Commit-Author: Agent
Replit-Commit-Session-Id: 688c3215-cde2-4006-bf1d-e6e20f9b3140
Replit-Commit-Checkpoint-Type: full_checkpoint
Replit-Commit-Event-Id: e1d44692-8f6e-4808-89e7-e653bc2e3823
Replit-Commit-Screenshot-Url: https://storage.googleapis.com/screenshot-production-us-central1/4712c1fd-8a9c-4f17-8447-bba9f11fbbc3/688c3215-cde2-4006-bf1d-e6e20f9b3140/CissVYp
Replit-Helium-Checkpoint-Created: true
</commit_message>
<xml_diff>
--- a/Unit8_Final_Capstone_Report_corrected.docx
+++ b/Unit8_Final_Capstone_Report_corrected.docx
@@ -9062,6 +9062,38 @@
       </w:pPr>
       <w:r>
         <w:br w:type="page"/>
+      </w:r>
+    </w:p>
+    <w:p>
+      <w:pPr>
+        <w:spacing w:after="120" w:line="480" w:lineRule="auto"/>
+        <w:ind w:firstLine="720"/>
+      </w:pPr>
+      <w:r>
+        <w:rPr>
+          <w:rFonts w:ascii="Times New Roman" w:hAnsi="Times New Roman"/>
+          <w:sz w:val="24"/>
+        </w:rPr>
+        <w:t>The remainder of this report is organized as follows. Chapter 2 reviews the existing literature on SIEM systems, cross-domain solutions, and multi-domain threat correlation, identifying the research gaps this project addresses. Chapter 3 describes the five-layer architecture design, data model, module structure, algorithmic design, technology stack, and Windows desktop deployment approach. Chapter 4 presents the implementation results, system testing outcomes, performance evaluation metrics, and CI/CD pipeline results. Chapter 5 discusses the findings in the context of the literature, evaluates the testing contribution to quality, outlines the maintenance plan, and addresses limitations. Chapter 6 concludes with a summary of contributions and directions for future work. Supporting materials are provided in the References section and Appendices A through D.</w:t>
+      </w:r>
+    </w:p>
+    <w:p>
+      <w:pPr>
+        <w:pStyle w:val="Heading2"/>
+        <w:spacing w:line="480" w:lineRule="auto"/>
+        <w:rPr>
+          <w:rFonts w:ascii="Times New Roman" w:hAnsi="Times New Roman" w:cs="Times New Roman"/>
+          <w:color w:val="auto"/>
+        </w:rPr>
+      </w:pPr>
+      <w:bookmarkStart w:id="13" w:name="_Toc230941993"/>
+      <w:bookmarkEnd w:id="13"/>
+      <w:r>
+        <w:rPr>
+          <w:rFonts w:ascii="Times New Roman" w:hAnsi="Times New Roman" w:cs="Times New Roman"/>
+          <w:color w:val="auto"/>
+        </w:rPr>
+        <w:t>1.7 Report Organization</w:t>
       </w:r>
     </w:p>
     <w:p>

</xml_diff>

<commit_message>
Update report to include and fix organization section details
Correct the positioning and content of the report organization section.

Replit-Commit-Author: Agent
Replit-Commit-Session-Id: 688c3215-cde2-4006-bf1d-e6e20f9b3140
Replit-Commit-Checkpoint-Type: full_checkpoint
Replit-Commit-Event-Id: ff52d3d7-7ca1-4020-862e-053cf1a2a28f
Replit-Commit-Screenshot-Url: https://storage.googleapis.com/screenshot-production-us-central1/4712c1fd-8a9c-4f17-8447-bba9f11fbbc3/688c3215-cde2-4006-bf1d-e6e20f9b3140/CissVYp
Replit-Helium-Checkpoint-Created: true
</commit_message>
<xml_diff>
--- a/Unit8_Final_Capstone_Report_corrected.docx
+++ b/Unit8_Final_Capstone_Report_corrected.docx
@@ -9066,6 +9066,25 @@
     </w:p>
     <w:p>
       <w:pPr>
+        <w:pStyle w:val="Heading2"/>
+        <w:spacing w:line="480" w:lineRule="auto"/>
+        <w:rPr>
+          <w:rFonts w:ascii="Times New Roman" w:hAnsi="Times New Roman" w:cs="Times New Roman"/>
+          <w:color w:val="auto"/>
+        </w:rPr>
+      </w:pPr>
+      <w:bookmarkStart w:id="13" w:name="_Toc230941993"/>
+      <w:bookmarkEnd w:id="13"/>
+      <w:r>
+        <w:rPr>
+          <w:rFonts w:ascii="Times New Roman" w:hAnsi="Times New Roman" w:cs="Times New Roman"/>
+          <w:color w:val="auto"/>
+        </w:rPr>
+        <w:t>1.7 Report Organization</w:t>
+      </w:r>
+    </w:p>
+    <w:p>
+      <w:pPr>
         <w:spacing w:after="120" w:line="480" w:lineRule="auto"/>
         <w:ind w:firstLine="720"/>
       </w:pPr>
@@ -9075,25 +9094,6 @@
           <w:sz w:val="24"/>
         </w:rPr>
         <w:t>The remainder of this report is organized as follows. Chapter 2 reviews the existing literature on SIEM systems, cross-domain solutions, and multi-domain threat correlation, identifying the research gaps this project addresses. Chapter 3 describes the five-layer architecture design, data model, module structure, algorithmic design, technology stack, and Windows desktop deployment approach. Chapter 4 presents the implementation results, system testing outcomes, performance evaluation metrics, and CI/CD pipeline results. Chapter 5 discusses the findings in the context of the literature, evaluates the testing contribution to quality, outlines the maintenance plan, and addresses limitations. Chapter 6 concludes with a summary of contributions and directions for future work. Supporting materials are provided in the References section and Appendices A through D.</w:t>
-      </w:r>
-    </w:p>
-    <w:p>
-      <w:pPr>
-        <w:pStyle w:val="Heading2"/>
-        <w:spacing w:line="480" w:lineRule="auto"/>
-        <w:rPr>
-          <w:rFonts w:ascii="Times New Roman" w:hAnsi="Times New Roman" w:cs="Times New Roman"/>
-          <w:color w:val="auto"/>
-        </w:rPr>
-      </w:pPr>
-      <w:bookmarkStart w:id="13" w:name="_Toc230941993"/>
-      <w:bookmarkEnd w:id="13"/>
-      <w:r>
-        <w:rPr>
-          <w:rFonts w:ascii="Times New Roman" w:hAnsi="Times New Roman" w:cs="Times New Roman"/>
-          <w:color w:val="auto"/>
-        </w:rPr>
-        <w:t>1.7 Report Organization</w:t>
       </w:r>
     </w:p>
     <w:p>

</xml_diff>